<commit_message>
Re-angle the six-uses critique (measurability)
The prior "none measurable" framing overclaimed: a fund balance or a staffing
ratio can be measured. Re-angle to what is defensible: the six uses are broad,
"unrestricted" budget categories offered with no target or reporting attached,
and not one addresses the special-education need the District itself names.
Update the problem-vs-plan share image and the Word doc to match.

Co-Authored-By: Claude Opus 4.8 (1M context) <noreply@anthropic.com>
Claude-Session: https://claude.ai/code/session_01MywNj1Vp2SFeReaXLDtvfg
</commit_message>
<xml_diff>
--- a/assets/TSD-Enhancement-Millage-Analysis.docx
+++ b/assets/TSD-Enhancement-Millage-Analysis.docx
@@ -58,7 +58,7 @@
           <w:i w:val="0"/>
           <w:sz w:val="22"/>
         </w:rPr>
-        <w:t>On June 30, 2026, the Troy School District emailed residents a newsletter urging a “yes” vote on the 1.5-mill county enhancement millage. Read it closely and it makes the case against itself. In the same email, the District (1) names the real funding problem, special education; then (2) proposes to spend the money on six vague, unmeasurable slogans; and (3) leans on a “44% of Michigan students already have this” pitch that implies Oakland is behind when the state’s own data show it is well ahead. That is misleading at best. Asking voters for six years of “unrestricted” general-fund dollars with no measurable plan is, at worst, a blank check.</w:t>
+        <w:t>On June 30, 2026, the Troy School District emailed residents a newsletter urging a “yes” vote on the 1.5-mill county enhancement millage. Read it closely and it makes the case against itself. In the same email, the District (1) names the real funding problem, special education; then (2) proposes to spend the money on six broad, uncommitted budget categories; and (3) leans on a “44% of Michigan students already have this” pitch that implies Oakland is behind when the state’s own data show it is well ahead. That is misleading at best. Asking voters for six years of “unrestricted” general-fund dollars with no committed plan is, at worst, a blank check.</w:t>
       </w:r>
     </w:p>
     <w:p>
@@ -162,7 +162,7 @@
                 <w:color w:val="555555"/>
                 <w:sz w:val="21"/>
               </w:rPr>
-              <w:t>Troy’s six stated uses, every one a slogan, none with a measurable target:</w:t>
+              <w:t>Troy’s six stated uses: broad budget categories offered as “unrestricted” funds, with no target or reporting attached:</w:t>
             </w:r>
           </w:p>
           <w:p>
@@ -328,7 +328,7 @@
           <w:color w:val="1F2A44"/>
           <w:sz w:val="27"/>
         </w:rPr>
-        <w:t>2.  Then they proposed a grab bag, with nothing to measure</w:t>
+        <w:t>2.  Then they proposed a grab bag, with nothing committed</w:t>
       </w:r>
     </w:p>
     <w:p>
@@ -342,7 +342,7 @@
           <w:i w:val="0"/>
           <w:sz w:val="22"/>
         </w:rPr>
-        <w:t>Having named the problem, the email does not commit a single dollar to solving it. Instead it advertises that the money is “unrestricted”: “one district could use the funds to increase pay for their teachers, another could buy school buses, yet another could hire a school resource officer… a variety of uses to support their budgetary goals.” Troy’s own six “uses” (above) are slogans, not commitments: “Staff Retention &amp; Raises,” “Enhance Student Wellness Supports,” “Maintain &amp; Strengthen District Programming.” None has a target, a number, a baseline, or a way for a taxpayer to check, in 2031, whether the $57 million Troy will have collected actually did what was promised. “Local flexibility” is being used to mean “trust us.” For a six-year tax on your home, voters deserve better than a wish list.</w:t>
+        <w:t>Having named the problem, the email does not commit a single dollar to solving it. Instead it advertises that the money is “unrestricted”: “one district could use the funds to increase pay for their teachers, another could buy school buses, yet another could hire a school resource officer… a variety of uses to support their budgetary goals.” Troy’s own six “uses” (above) are broad budget categories, not commitments. Some a district could genuinely measure (a fund balance, a staffing ratio), which is exactly why it should set targets and report them. It has not: no target, no baseline, and no reporting for any of the six, and because the money is “unrestricted,” nothing binds it to any of them. No way for a taxpayer to check, in 2031, whether the $57 million Troy will have collected actually did what was promised. “Local flexibility” is being used to mean “trust us.” For a six-year tax on your home, voters deserve better than a wish list.</w:t>
       </w:r>
     </w:p>
     <w:p>
@@ -960,7 +960,7 @@
               <w:t>• Maintain &amp; Strengthen District Programming</w:t>
               <w:br/>
               <w:br/>
-              <w:t>Six slogans. Not one measurable target. Not one dollar committed to the special-education gap they just named. Their own email brags the money is “unrestricted”… “a variety of uses.” That’s not a plan. It’s a grab bag.</w:t>
+              <w:t>Six broad budget categories. The District sets no target and no reporting for any of them, and its own email calls the money “unrestricted”… “a variety of uses.” Not one dollar is committed to the special-education gap it just named. That is not a plan. It is a grab bag.</w:t>
               <w:br/>
               <w:br/>
               <w:t>And the “44% of Michigan already has this” pitch implies we’re behind. We’re not (see the chart, second image). Oakland already raises more LOCAL funding per student ($9,184) than Macomb ($7,247), a county that ALREADY levies an enhancement. We lead in local dollars without one, and passing this only widens that local gap.</w:t>

</xml_diff>

<commit_message>
Add net-contributor stat, link the District newsletter (scrubbed), refresh assets
- Add "Oakland is already a net contributor" stat (~16% of the state's school
  tax base, ~12% of students, ~$85M/yr net subsidy via the State Education Tax)
  to the site, the Facebook post, and the funding-table image.
- Add a scrubbed full-text transcript of the District's June 30 newsletter
  (assets/district-email.html) with recipient info and tracking links removed,
  linked from the email section and sources.

Co-Authored-By: Claude Opus 4.8 (1M context) <noreply@anthropic.com>
Claude-Session: https://claude.ai/code/session_01MywNj1Vp2SFeReaXLDtvfg
</commit_message>
<xml_diff>
--- a/assets/TSD-Enhancement-Millage-Analysis.docx
+++ b/assets/TSD-Enhancement-Millage-Analysis.docx
@@ -974,7 +974,10 @@
               <w:br/>
               <w:t>• So the numbers above ($9,184 vs. $7,247) are LOCAL money, not total spending. Count state aid and the total per student is close: about $17,100 per pupil in Oakland vs. about $16,100 in Macomb. Michigan sends more state aid to places that raise less locally, which evens the total out.</w:t>
               <w:br/>
-              <w:t>• Bottom line: Oakland already taxes itself far more LOCALLY for schools (27% more per student) than a county that already has an enhancement. This proposal piles on even more local money. We are not behind.</w:t>
+              <w:t>• Bottom line: Oakland already taxes itself far more LOCALLY for schools (27% more per student) than a county that already has an enhancement. This proposal piles on even more local money.</w:t>
+              <w:br/>
+              <w:br/>
+              <w:t>💡 THE BIGGER PICTURE: Oakland already pays MORE than its share into Michigan's schools. Under Proposal A, the 6-mill State Education Tax (plus state sales and income taxes) is pooled statewide and handed back per pupil. Oakland's districts hold about 16% of the state's school property tax base but educate only about 12% of its students, so Oakland taxpayers already subsidize schools elsewhere by an estimated $85 million or more a year through the State Education Tax alone. We are not behind. We already carry more than our share, and this proposal asks us to tax ourselves even more locally.</w:t>
               <w:br/>
               <w:br/>
               <w:t>THE ASK: If special education is the need, fund THAT. Dedicate 100% of the enhancement to special education, and report every year how much general-fund money it frees up. Measurable. Accountable. Honest.</w:t>
@@ -1062,7 +1065,7 @@
       <w:r>
         <w:drawing>
           <wp:inline xmlns:a="http://schemas.openxmlformats.org/drawingml/2006/main" xmlns:pic="http://schemas.openxmlformats.org/drawingml/2006/picture">
-            <wp:extent cx="5852160" cy="3209821"/>
+            <wp:extent cx="5852160" cy="3777303"/>
             <wp:docPr id="2" name="Picture 2"/>
             <wp:cNvGraphicFramePr>
               <a:graphicFrameLocks noChangeAspect="1"/>
@@ -1083,7 +1086,7 @@
                   <pic:spPr>
                     <a:xfrm>
                       <a:off x="0" y="0"/>
-                      <a:ext cx="5852160" cy="3209821"/>
+                      <a:ext cx="5852160" cy="3777303"/>
                     </a:xfrm>
                     <a:prstGeom prst="rect"/>
                   </pic:spPr>

</xml_diff>